<commit_message>
Lab3: Fix report. Lab4: Generated Python Bytecode
</commit_message>
<xml_diff>
--- a/Задание 3 С#/Лр3_С#_Мавзовин_Пётр_ТКИ341_18.docx
+++ b/Задание 3 С#/Лр3_С#_Мавзовин_Пётр_ТКИ341_18.docx
@@ -149,7 +149,6 @@
           <w:rFonts w:cs="Times New Roman"/>
           <w:b/>
           <w:szCs w:val="28"/>
-          <w:lang w:val="en-US"/>
         </w:rPr>
       </w:pPr>
       <w:r>
@@ -165,7 +164,6 @@
           <w:rFonts w:cs="Times New Roman"/>
           <w:b/>
           <w:szCs w:val="28"/>
-          <w:lang w:val="en-US"/>
         </w:rPr>
         <w:t>3</w:t>
       </w:r>
@@ -396,27 +394,17 @@
     </w:p>
     <w:p>
       <w:pPr>
-        <w:jc w:val="center"/>
-        <w:rPr>
-          <w:rFonts w:cs="Times New Roman"/>
-          <w:szCs w:val="28"/>
-        </w:rPr>
-      </w:pPr>
-    </w:p>
-    <w:p>
-      <w:pPr>
-        <w:jc w:val="center"/>
-        <w:rPr>
-          <w:rFonts w:cs="Times New Roman"/>
-          <w:szCs w:val="28"/>
-        </w:rPr>
-      </w:pPr>
-      <w:r>
-        <w:rPr>
-          <w:rFonts w:cs="Times New Roman"/>
-          <w:szCs w:val="28"/>
-        </w:rPr>
-        <w:lastRenderedPageBreak/>
+        <w:ind w:left="2832" w:firstLine="708"/>
+        <w:rPr>
+          <w:rFonts w:cs="Times New Roman"/>
+          <w:szCs w:val="28"/>
+        </w:rPr>
+      </w:pPr>
+      <w:r>
+        <w:rPr>
+          <w:rFonts w:cs="Times New Roman"/>
+          <w:szCs w:val="28"/>
+        </w:rPr>
         <w:t>Москва – 2026</w:t>
       </w:r>
     </w:p>
@@ -498,7 +486,7 @@
             </w:rPr>
             <w:fldChar w:fldCharType="separate"/>
           </w:r>
-          <w:hyperlink w:anchor="_Toc231323509" w:history="1">
+          <w:hyperlink w:anchor="_Toc231395072" w:history="1">
             <w:r>
               <w:rPr>
                 <w:rStyle w:val="a6"/>
@@ -560,7 +548,7 @@
                 <w:noProof/>
                 <w:webHidden/>
               </w:rPr>
-              <w:instrText xml:space="preserve"> PAGEREF _Toc231323509 \h </w:instrText>
+              <w:instrText xml:space="preserve"> PAGEREF _Toc231395072 \h </w:instrText>
             </w:r>
             <w:r>
               <w:rPr>
@@ -601,7 +589,7 @@
               <w:lang w:eastAsia="ru-RU"/>
             </w:rPr>
           </w:pPr>
-          <w:hyperlink w:anchor="_Toc231323510" w:history="1">
+          <w:hyperlink w:anchor="_Toc231395073" w:history="1">
             <w:r>
               <w:rPr>
                 <w:rStyle w:val="a6"/>
@@ -630,7 +618,7 @@
                 <w:noProof/>
                 <w:webHidden/>
               </w:rPr>
-              <w:instrText xml:space="preserve"> PAGEREF _Toc231323510 \h </w:instrText>
+              <w:instrText xml:space="preserve"> PAGEREF _Toc231395073 \h </w:instrText>
             </w:r>
             <w:r>
               <w:rPr>
@@ -651,6 +639,368 @@
                 <w:webHidden/>
               </w:rPr>
               <w:t>4</w:t>
+            </w:r>
+            <w:r>
+              <w:rPr>
+                <w:noProof/>
+                <w:webHidden/>
+              </w:rPr>
+              <w:fldChar w:fldCharType="end"/>
+            </w:r>
+          </w:hyperlink>
+        </w:p>
+        <w:p>
+          <w:pPr>
+            <w:pStyle w:val="11"/>
+            <w:rPr>
+              <w:rFonts w:asciiTheme="minorHAnsi" w:eastAsiaTheme="minorEastAsia" w:hAnsiTheme="minorHAnsi"/>
+              <w:noProof/>
+              <w:sz w:val="22"/>
+              <w:lang w:eastAsia="ru-RU"/>
+            </w:rPr>
+          </w:pPr>
+          <w:hyperlink w:anchor="_Toc231395074" w:history="1">
+            <w:r>
+              <w:rPr>
+                <w:rStyle w:val="a6"/>
+                <w:rFonts w:cs="Times New Roman"/>
+                <w:noProof/>
+              </w:rPr>
+              <w:t>.</w:t>
+            </w:r>
+            <w:r>
+              <w:rPr>
+                <w:rStyle w:val="a6"/>
+                <w:rFonts w:cs="Times New Roman"/>
+                <w:noProof/>
+                <w:lang w:val="en-US"/>
+              </w:rPr>
+              <w:t>NET</w:t>
+            </w:r>
+            <w:r>
+              <w:rPr>
+                <w:rStyle w:val="a6"/>
+                <w:rFonts w:cs="Times New Roman"/>
+                <w:noProof/>
+              </w:rPr>
+              <w:t xml:space="preserve"> </w:t>
+            </w:r>
+            <w:r>
+              <w:rPr>
+                <w:rStyle w:val="a6"/>
+                <w:rFonts w:cs="Times New Roman"/>
+                <w:noProof/>
+                <w:lang w:val="en-US"/>
+              </w:rPr>
+              <w:t>Reflector</w:t>
+            </w:r>
+            <w:r>
+              <w:rPr>
+                <w:noProof/>
+                <w:webHidden/>
+              </w:rPr>
+              <w:tab/>
+            </w:r>
+            <w:r>
+              <w:rPr>
+                <w:noProof/>
+                <w:webHidden/>
+              </w:rPr>
+              <w:fldChar w:fldCharType="begin"/>
+            </w:r>
+            <w:r>
+              <w:rPr>
+                <w:noProof/>
+                <w:webHidden/>
+              </w:rPr>
+              <w:instrText xml:space="preserve"> PAGEREF _Toc231395074 \h </w:instrText>
+            </w:r>
+            <w:r>
+              <w:rPr>
+                <w:noProof/>
+                <w:webHidden/>
+              </w:rPr>
+            </w:r>
+            <w:r>
+              <w:rPr>
+                <w:noProof/>
+                <w:webHidden/>
+              </w:rPr>
+              <w:fldChar w:fldCharType="separate"/>
+            </w:r>
+            <w:r>
+              <w:rPr>
+                <w:noProof/>
+                <w:webHidden/>
+              </w:rPr>
+              <w:t>6</w:t>
+            </w:r>
+            <w:r>
+              <w:rPr>
+                <w:noProof/>
+                <w:webHidden/>
+              </w:rPr>
+              <w:fldChar w:fldCharType="end"/>
+            </w:r>
+          </w:hyperlink>
+        </w:p>
+        <w:p>
+          <w:pPr>
+            <w:pStyle w:val="11"/>
+            <w:rPr>
+              <w:rFonts w:asciiTheme="minorHAnsi" w:eastAsiaTheme="minorEastAsia" w:hAnsiTheme="minorHAnsi"/>
+              <w:noProof/>
+              <w:sz w:val="22"/>
+              <w:lang w:eastAsia="ru-RU"/>
+            </w:rPr>
+          </w:pPr>
+          <w:hyperlink w:anchor="_Toc231395075" w:history="1">
+            <w:r>
+              <w:rPr>
+                <w:rStyle w:val="a6"/>
+                <w:rFonts w:cs="Times New Roman"/>
+                <w:noProof/>
+              </w:rPr>
+              <w:t>Сравнение .</w:t>
+            </w:r>
+            <w:r>
+              <w:rPr>
+                <w:rStyle w:val="a6"/>
+                <w:rFonts w:cs="Times New Roman"/>
+                <w:noProof/>
+                <w:lang w:val="en-US"/>
+              </w:rPr>
+              <w:t>NET</w:t>
+            </w:r>
+            <w:r>
+              <w:rPr>
+                <w:rStyle w:val="a6"/>
+                <w:rFonts w:cs="Times New Roman"/>
+                <w:noProof/>
+              </w:rPr>
+              <w:t xml:space="preserve"> </w:t>
+            </w:r>
+            <w:r>
+              <w:rPr>
+                <w:rStyle w:val="a6"/>
+                <w:rFonts w:cs="Times New Roman"/>
+                <w:noProof/>
+                <w:lang w:val="en-US"/>
+              </w:rPr>
+              <w:t>Reflector</w:t>
+            </w:r>
+            <w:r>
+              <w:rPr>
+                <w:rStyle w:val="a6"/>
+                <w:rFonts w:cs="Times New Roman"/>
+                <w:noProof/>
+              </w:rPr>
+              <w:t xml:space="preserve"> и </w:t>
+            </w:r>
+            <w:r>
+              <w:rPr>
+                <w:rStyle w:val="a6"/>
+                <w:rFonts w:cs="Times New Roman"/>
+                <w:noProof/>
+                <w:lang w:val="en-US"/>
+              </w:rPr>
+              <w:t>ILSpy</w:t>
+            </w:r>
+            <w:r>
+              <w:rPr>
+                <w:noProof/>
+                <w:webHidden/>
+              </w:rPr>
+              <w:tab/>
+            </w:r>
+            <w:r>
+              <w:rPr>
+                <w:noProof/>
+                <w:webHidden/>
+              </w:rPr>
+              <w:fldChar w:fldCharType="begin"/>
+            </w:r>
+            <w:r>
+              <w:rPr>
+                <w:noProof/>
+                <w:webHidden/>
+              </w:rPr>
+              <w:instrText xml:space="preserve"> PAGEREF _Toc231395075 \h </w:instrText>
+            </w:r>
+            <w:r>
+              <w:rPr>
+                <w:noProof/>
+                <w:webHidden/>
+              </w:rPr>
+            </w:r>
+            <w:r>
+              <w:rPr>
+                <w:noProof/>
+                <w:webHidden/>
+              </w:rPr>
+              <w:fldChar w:fldCharType="separate"/>
+            </w:r>
+            <w:r>
+              <w:rPr>
+                <w:noProof/>
+                <w:webHidden/>
+              </w:rPr>
+              <w:t>8</w:t>
+            </w:r>
+            <w:r>
+              <w:rPr>
+                <w:noProof/>
+                <w:webHidden/>
+              </w:rPr>
+              <w:fldChar w:fldCharType="end"/>
+            </w:r>
+          </w:hyperlink>
+        </w:p>
+        <w:p>
+          <w:pPr>
+            <w:pStyle w:val="11"/>
+            <w:rPr>
+              <w:rFonts w:asciiTheme="minorHAnsi" w:eastAsiaTheme="minorEastAsia" w:hAnsiTheme="minorHAnsi"/>
+              <w:noProof/>
+              <w:sz w:val="22"/>
+              <w:lang w:eastAsia="ru-RU"/>
+            </w:rPr>
+          </w:pPr>
+          <w:hyperlink w:anchor="_Toc231395076" w:history="1">
+            <w:r>
+              <w:rPr>
+                <w:rStyle w:val="a6"/>
+                <w:rFonts w:cs="Times New Roman"/>
+                <w:noProof/>
+              </w:rPr>
+              <w:t xml:space="preserve">Двоичный код программы на </w:t>
+            </w:r>
+            <w:r>
+              <w:rPr>
+                <w:rStyle w:val="a6"/>
+                <w:rFonts w:cs="Times New Roman"/>
+                <w:noProof/>
+                <w:lang w:val="en-US"/>
+              </w:rPr>
+              <w:t>C</w:t>
+            </w:r>
+            <w:r>
+              <w:rPr>
+                <w:rStyle w:val="a6"/>
+                <w:rFonts w:cs="Times New Roman"/>
+                <w:noProof/>
+              </w:rPr>
+              <w:t>#</w:t>
+            </w:r>
+            <w:r>
+              <w:rPr>
+                <w:noProof/>
+                <w:webHidden/>
+              </w:rPr>
+              <w:tab/>
+            </w:r>
+            <w:r>
+              <w:rPr>
+                <w:noProof/>
+                <w:webHidden/>
+              </w:rPr>
+              <w:fldChar w:fldCharType="begin"/>
+            </w:r>
+            <w:r>
+              <w:rPr>
+                <w:noProof/>
+                <w:webHidden/>
+              </w:rPr>
+              <w:instrText xml:space="preserve"> PAGEREF _Toc231395076 \h </w:instrText>
+            </w:r>
+            <w:r>
+              <w:rPr>
+                <w:noProof/>
+                <w:webHidden/>
+              </w:rPr>
+            </w:r>
+            <w:r>
+              <w:rPr>
+                <w:noProof/>
+                <w:webHidden/>
+              </w:rPr>
+              <w:fldChar w:fldCharType="separate"/>
+            </w:r>
+            <w:r>
+              <w:rPr>
+                <w:noProof/>
+                <w:webHidden/>
+              </w:rPr>
+              <w:t>8</w:t>
+            </w:r>
+            <w:r>
+              <w:rPr>
+                <w:noProof/>
+                <w:webHidden/>
+              </w:rPr>
+              <w:fldChar w:fldCharType="end"/>
+            </w:r>
+          </w:hyperlink>
+        </w:p>
+        <w:p>
+          <w:pPr>
+            <w:pStyle w:val="11"/>
+            <w:rPr>
+              <w:rFonts w:asciiTheme="minorHAnsi" w:eastAsiaTheme="minorEastAsia" w:hAnsiTheme="minorHAnsi"/>
+              <w:noProof/>
+              <w:sz w:val="22"/>
+              <w:lang w:eastAsia="ru-RU"/>
+            </w:rPr>
+          </w:pPr>
+          <w:hyperlink w:anchor="_Toc231395077" w:history="1">
+            <w:r>
+              <w:rPr>
+                <w:rStyle w:val="a6"/>
+                <w:rFonts w:cs="Times New Roman"/>
+                <w:noProof/>
+              </w:rPr>
+              <w:t>Вывод</w:t>
+            </w:r>
+            <w:r>
+              <w:rPr>
+                <w:noProof/>
+                <w:webHidden/>
+              </w:rPr>
+              <w:tab/>
+            </w:r>
+            <w:r>
+              <w:rPr>
+                <w:noProof/>
+                <w:webHidden/>
+              </w:rPr>
+              <w:fldChar w:fldCharType="begin"/>
+            </w:r>
+            <w:r>
+              <w:rPr>
+                <w:noProof/>
+                <w:webHidden/>
+              </w:rPr>
+              <w:instrText xml:space="preserve"> PAGEREF _Toc231395077 \h </w:instrText>
+            </w:r>
+            <w:r>
+              <w:rPr>
+                <w:noProof/>
+                <w:webHidden/>
+              </w:rPr>
+            </w:r>
+            <w:r>
+              <w:rPr>
+                <w:noProof/>
+                <w:webHidden/>
+              </w:rPr>
+              <w:fldChar w:fldCharType="separate"/>
+            </w:r>
+            <w:r>
+              <w:rPr>
+                <w:noProof/>
+                <w:webHidden/>
+              </w:rPr>
+              <w:t>11</w:t>
             </w:r>
             <w:r>
               <w:rPr>
@@ -715,7 +1065,7 @@
           <w:szCs w:val="28"/>
         </w:rPr>
       </w:pPr>
-      <w:bookmarkStart w:id="0" w:name="_Toc231323509"/>
+      <w:bookmarkStart w:id="0" w:name="_Toc231395072"/>
       <w:r>
         <w:rPr>
           <w:rStyle w:val="a8"/>
@@ -871,15 +1221,7 @@
           <w:szCs w:val="28"/>
           <w:shd w:val="clear" w:color="auto" w:fill="FFFFFF"/>
         </w:rPr>
-        <w:t xml:space="preserve">Рисунок 1 – </w:t>
-      </w:r>
-      <w:r>
-        <w:rPr>
-          <w:color w:val="0F1115"/>
-          <w:szCs w:val="28"/>
-          <w:shd w:val="clear" w:color="auto" w:fill="FFFFFF"/>
-        </w:rPr>
-        <w:t xml:space="preserve">Результат перевода программы с </w:t>
+        <w:t xml:space="preserve">Рисунок 1 – Результат перевода программы с </w:t>
       </w:r>
       <w:r>
         <w:rPr>
@@ -953,7 +1295,7 @@
           <w:lang w:val="en-US"/>
         </w:rPr>
       </w:pPr>
-      <w:bookmarkStart w:id="1" w:name="_Toc231323510"/>
+      <w:bookmarkStart w:id="1" w:name="_Toc231395073"/>
       <w:proofErr w:type="spellStart"/>
       <w:r>
         <w:rPr>
@@ -1045,15 +1387,7 @@
           <w:szCs w:val="28"/>
           <w:shd w:val="clear" w:color="auto" w:fill="FFFFFF"/>
         </w:rPr>
-        <w:t xml:space="preserve">Рисунок 2 – </w:t>
-      </w:r>
-      <w:r>
-        <w:rPr>
-          <w:color w:val="0F1115"/>
-          <w:szCs w:val="28"/>
-          <w:shd w:val="clear" w:color="auto" w:fill="FFFFFF"/>
-        </w:rPr>
-        <w:t xml:space="preserve">Заголовок </w:t>
+        <w:t xml:space="preserve">Рисунок 2 – Заголовок </w:t>
       </w:r>
       <w:proofErr w:type="spellStart"/>
       <w:r>
@@ -1188,40 +1522,23 @@
           <w:color w:val="0F1115"/>
           <w:szCs w:val="28"/>
           <w:shd w:val="clear" w:color="auto" w:fill="FFFFFF"/>
+        </w:rPr>
+      </w:pPr>
+      <w:r>
+        <w:rPr>
+          <w:color w:val="0F1115"/>
+          <w:szCs w:val="28"/>
+          <w:shd w:val="clear" w:color="auto" w:fill="FFFFFF"/>
+        </w:rPr>
+        <w:t xml:space="preserve">Рисунок 3 – </w:t>
+      </w:r>
+      <w:r>
+        <w:rPr>
+          <w:color w:val="0F1115"/>
+          <w:szCs w:val="28"/>
+          <w:shd w:val="clear" w:color="auto" w:fill="FFFFFF"/>
           <w:lang w:val="en-US"/>
         </w:rPr>
-      </w:pPr>
-      <w:r>
-        <w:rPr>
-          <w:color w:val="0F1115"/>
-          <w:szCs w:val="28"/>
-          <w:shd w:val="clear" w:color="auto" w:fill="FFFFFF"/>
-        </w:rPr>
-        <w:t xml:space="preserve">Рисунок </w:t>
-      </w:r>
-      <w:r>
-        <w:rPr>
-          <w:color w:val="0F1115"/>
-          <w:szCs w:val="28"/>
-          <w:shd w:val="clear" w:color="auto" w:fill="FFFFFF"/>
-        </w:rPr>
-        <w:t>3</w:t>
-      </w:r>
-      <w:r>
-        <w:rPr>
-          <w:color w:val="0F1115"/>
-          <w:szCs w:val="28"/>
-          <w:shd w:val="clear" w:color="auto" w:fill="FFFFFF"/>
-        </w:rPr>
-        <w:t xml:space="preserve"> – </w:t>
-      </w:r>
-      <w:r>
-        <w:rPr>
-          <w:color w:val="0F1115"/>
-          <w:szCs w:val="28"/>
-          <w:shd w:val="clear" w:color="auto" w:fill="FFFFFF"/>
-          <w:lang w:val="en-US"/>
-        </w:rPr>
         <w:t>COFF</w:t>
       </w:r>
       <w:r>
@@ -1230,15 +1547,7 @@
           <w:szCs w:val="28"/>
           <w:shd w:val="clear" w:color="auto" w:fill="FFFFFF"/>
         </w:rPr>
-        <w:t xml:space="preserve"> </w:t>
-      </w:r>
-      <w:r>
-        <w:rPr>
-          <w:color w:val="0F1115"/>
-          <w:szCs w:val="28"/>
-          <w:shd w:val="clear" w:color="auto" w:fill="FFFFFF"/>
-        </w:rPr>
-        <w:t xml:space="preserve">Заголовок </w:t>
+        <w:t xml:space="preserve"> Заголовок </w:t>
       </w:r>
       <w:proofErr w:type="spellStart"/>
       <w:r>
@@ -1575,6 +1884,7 @@
           <w:szCs w:val="28"/>
         </w:rPr>
       </w:pPr>
+      <w:bookmarkStart w:id="2" w:name="_Toc231395074"/>
       <w:r>
         <w:rPr>
           <w:rStyle w:val="a8"/>
@@ -1610,6 +1920,7 @@
         </w:rPr>
         <w:t>Reflector</w:t>
       </w:r>
+      <w:bookmarkEnd w:id="2"/>
     </w:p>
     <w:p>
       <w:pPr>
@@ -2017,7 +2328,26 @@
           <w:szCs w:val="28"/>
           <w:shd w:val="clear" w:color="auto" w:fill="FFFFFF"/>
         </w:rPr>
-        <w:t xml:space="preserve"> программы в</w:t>
+        <w:t xml:space="preserve"> программы в </w:t>
+      </w:r>
+      <w:r>
+        <w:rPr>
+          <w:color w:val="0F1115"/>
+          <w:sz w:val="28"/>
+          <w:szCs w:val="28"/>
+          <w:shd w:val="clear" w:color="auto" w:fill="FFFFFF"/>
+        </w:rPr>
+        <w:t>.</w:t>
+      </w:r>
+      <w:r>
+        <w:rPr>
+          <w:color w:val="0F1115"/>
+          <w:sz w:val="28"/>
+          <w:szCs w:val="28"/>
+          <w:shd w:val="clear" w:color="auto" w:fill="FFFFFF"/>
+          <w:lang w:val="en-US"/>
+        </w:rPr>
+        <w:t>NET</w:t>
       </w:r>
       <w:r>
         <w:rPr>
@@ -2034,36 +2364,8 @@
           <w:sz w:val="28"/>
           <w:szCs w:val="28"/>
           <w:shd w:val="clear" w:color="auto" w:fill="FFFFFF"/>
-        </w:rPr>
-        <w:t>.</w:t>
-      </w:r>
-      <w:r>
-        <w:rPr>
-          <w:color w:val="0F1115"/>
-          <w:sz w:val="28"/>
-          <w:szCs w:val="28"/>
-          <w:shd w:val="clear" w:color="auto" w:fill="FFFFFF"/>
           <w:lang w:val="en-US"/>
         </w:rPr>
-        <w:t>NET</w:t>
-      </w:r>
-      <w:r>
-        <w:rPr>
-          <w:color w:val="0F1115"/>
-          <w:sz w:val="28"/>
-          <w:szCs w:val="28"/>
-          <w:shd w:val="clear" w:color="auto" w:fill="FFFFFF"/>
-        </w:rPr>
-        <w:t xml:space="preserve"> </w:t>
-      </w:r>
-      <w:r>
-        <w:rPr>
-          <w:color w:val="0F1115"/>
-          <w:sz w:val="28"/>
-          <w:szCs w:val="28"/>
-          <w:shd w:val="clear" w:color="auto" w:fill="FFFFFF"/>
-          <w:lang w:val="en-US"/>
-        </w:rPr>
         <w:t>Reflector</w:t>
       </w:r>
     </w:p>
@@ -2095,9 +2397,9 @@
           <w:rStyle w:val="a8"/>
           <w:rFonts w:cs="Times New Roman"/>
           <w:szCs w:val="28"/>
-          <w:lang w:val="en-US"/>
-        </w:rPr>
-      </w:pPr>
+        </w:rPr>
+      </w:pPr>
+      <w:bookmarkStart w:id="3" w:name="_Toc231395075"/>
       <w:r>
         <w:rPr>
           <w:rStyle w:val="a8"/>
@@ -2112,8 +2414,24 @@
           <w:rStyle w:val="a8"/>
           <w:rFonts w:cs="Times New Roman"/>
           <w:szCs w:val="28"/>
+        </w:rPr>
+        <w:t xml:space="preserve"> .</w:t>
+      </w:r>
+      <w:r>
+        <w:rPr>
+          <w:rStyle w:val="a8"/>
+          <w:rFonts w:cs="Times New Roman"/>
+          <w:szCs w:val="28"/>
           <w:lang w:val="en-US"/>
         </w:rPr>
+        <w:t>NET</w:t>
+      </w:r>
+      <w:r>
+        <w:rPr>
+          <w:rStyle w:val="a8"/>
+          <w:rFonts w:cs="Times New Roman"/>
+          <w:szCs w:val="28"/>
+        </w:rPr>
         <w:t xml:space="preserve"> </w:t>
       </w:r>
       <w:r>
@@ -2123,239 +2441,213 @@
           <w:szCs w:val="28"/>
           <w:lang w:val="en-US"/>
         </w:rPr>
+        <w:t>Reflector</w:t>
+      </w:r>
+      <w:r>
+        <w:rPr>
+          <w:rStyle w:val="a8"/>
+          <w:rFonts w:cs="Times New Roman"/>
+          <w:szCs w:val="28"/>
+        </w:rPr>
+        <w:t xml:space="preserve"> </w:t>
+      </w:r>
+      <w:r>
+        <w:rPr>
+          <w:rStyle w:val="a8"/>
+          <w:rFonts w:cs="Times New Roman"/>
+          <w:szCs w:val="28"/>
+        </w:rPr>
+        <w:t>и</w:t>
+      </w:r>
+      <w:r>
+        <w:rPr>
+          <w:rStyle w:val="a8"/>
+          <w:rFonts w:cs="Times New Roman"/>
+          <w:szCs w:val="28"/>
+        </w:rPr>
+        <w:t xml:space="preserve"> </w:t>
+      </w:r>
+      <w:proofErr w:type="spellStart"/>
+      <w:r>
+        <w:rPr>
+          <w:rStyle w:val="a8"/>
+          <w:rFonts w:cs="Times New Roman"/>
+          <w:szCs w:val="28"/>
+          <w:lang w:val="en-US"/>
+        </w:rPr>
+        <w:t>ILSpy</w:t>
+      </w:r>
+      <w:bookmarkEnd w:id="3"/>
+      <w:proofErr w:type="spellEnd"/>
+    </w:p>
+    <w:p>
+      <w:pPr>
+        <w:rPr>
+          <w:szCs w:val="28"/>
+        </w:rPr>
+      </w:pPr>
+      <w:proofErr w:type="spellStart"/>
+      <w:r>
+        <w:rPr>
+          <w:szCs w:val="28"/>
+          <w:lang w:val="en-US"/>
+        </w:rPr>
+        <w:t>ILSpy</w:t>
+      </w:r>
+      <w:proofErr w:type="spellEnd"/>
+      <w:r>
+        <w:rPr>
+          <w:szCs w:val="28"/>
+        </w:rPr>
+        <w:t xml:space="preserve"> </w:t>
+      </w:r>
+      <w:r>
+        <w:rPr>
+          <w:szCs w:val="28"/>
+        </w:rPr>
+        <w:t xml:space="preserve">предоставляет возможность Метаданных и </w:t>
+      </w:r>
+      <w:proofErr w:type="spellStart"/>
+      <w:r>
+        <w:rPr>
+          <w:szCs w:val="28"/>
+        </w:rPr>
+        <w:t>Дебаг</w:t>
+      </w:r>
+      <w:proofErr w:type="spellEnd"/>
+      <w:r>
+        <w:rPr>
+          <w:szCs w:val="28"/>
+        </w:rPr>
+        <w:t>-</w:t>
+      </w:r>
+      <w:proofErr w:type="gramStart"/>
+      <w:r>
+        <w:rPr>
+          <w:szCs w:val="28"/>
+        </w:rPr>
+        <w:t>метаданных(</w:t>
+      </w:r>
+      <w:proofErr w:type="gramEnd"/>
+      <w:r>
+        <w:rPr>
+          <w:szCs w:val="28"/>
+        </w:rPr>
+        <w:t xml:space="preserve">при сборке в режиме </w:t>
+      </w:r>
+      <w:r>
+        <w:rPr>
+          <w:szCs w:val="28"/>
+          <w:lang w:val="en-US"/>
+        </w:rPr>
+        <w:t>Debug</w:t>
+      </w:r>
+      <w:r>
+        <w:rPr>
+          <w:szCs w:val="28"/>
+        </w:rPr>
+        <w:t>)</w:t>
+      </w:r>
+      <w:r>
+        <w:rPr>
+          <w:szCs w:val="28"/>
+        </w:rPr>
+        <w:t xml:space="preserve">. </w:t>
+      </w:r>
+      <w:r>
+        <w:rPr>
+          <w:szCs w:val="28"/>
+        </w:rPr>
+        <w:t xml:space="preserve">При этом </w:t>
+      </w:r>
+      <w:proofErr w:type="spellStart"/>
+      <w:r>
+        <w:rPr>
+          <w:szCs w:val="28"/>
+        </w:rPr>
+        <w:t>декомпилированный</w:t>
+      </w:r>
+      <w:proofErr w:type="spellEnd"/>
+      <w:r>
+        <w:rPr>
+          <w:szCs w:val="28"/>
+        </w:rPr>
+        <w:t xml:space="preserve"> псевдокод в </w:t>
+      </w:r>
+      <w:r>
+        <w:rPr>
+          <w:szCs w:val="28"/>
+        </w:rPr>
         <w:t>.</w:t>
       </w:r>
       <w:r>
         <w:rPr>
+          <w:szCs w:val="28"/>
+          <w:lang w:val="en-US"/>
+        </w:rPr>
+        <w:t>NET</w:t>
+      </w:r>
+      <w:r>
+        <w:rPr>
+          <w:szCs w:val="28"/>
+        </w:rPr>
+        <w:t xml:space="preserve"> </w:t>
+      </w:r>
+      <w:r>
+        <w:rPr>
+          <w:szCs w:val="28"/>
+          <w:lang w:val="en-US"/>
+        </w:rPr>
+        <w:t>Reflector</w:t>
+      </w:r>
+      <w:r>
+        <w:rPr>
+          <w:szCs w:val="28"/>
+        </w:rPr>
+        <w:t xml:space="preserve"> </w:t>
+      </w:r>
+      <w:r>
+        <w:rPr>
+          <w:szCs w:val="28"/>
+        </w:rPr>
+        <w:t>выглядит значительно проще и понятнее.</w:t>
+      </w:r>
+    </w:p>
+    <w:p>
+      <w:pPr>
+        <w:rPr>
           <w:rStyle w:val="a8"/>
           <w:rFonts w:cs="Times New Roman"/>
           <w:szCs w:val="28"/>
+        </w:rPr>
+      </w:pPr>
+      <w:bookmarkStart w:id="4" w:name="_Toc231395076"/>
+      <w:r>
+        <w:rPr>
+          <w:rStyle w:val="a8"/>
+          <w:rFonts w:cs="Times New Roman"/>
+          <w:szCs w:val="28"/>
+        </w:rPr>
+        <w:t xml:space="preserve">Двоичный код программы на </w:t>
+      </w:r>
+      <w:r>
+        <w:rPr>
+          <w:rStyle w:val="a8"/>
+          <w:rFonts w:cs="Times New Roman"/>
+          <w:szCs w:val="28"/>
           <w:lang w:val="en-US"/>
         </w:rPr>
-        <w:t>NET</w:t>
+        <w:t>C</w:t>
       </w:r>
       <w:r>
         <w:rPr>
           <w:rStyle w:val="a8"/>
           <w:rFonts w:cs="Times New Roman"/>
           <w:szCs w:val="28"/>
-          <w:lang w:val="en-US"/>
-        </w:rPr>
-        <w:t xml:space="preserve"> </w:t>
-      </w:r>
-      <w:r>
-        <w:rPr>
-          <w:rStyle w:val="a8"/>
-          <w:rFonts w:cs="Times New Roman"/>
-          <w:szCs w:val="28"/>
-          <w:lang w:val="en-US"/>
-        </w:rPr>
-        <w:t>Reflector</w:t>
-      </w:r>
-      <w:r>
-        <w:rPr>
-          <w:rStyle w:val="a8"/>
-          <w:rFonts w:cs="Times New Roman"/>
-          <w:szCs w:val="28"/>
-          <w:lang w:val="en-US"/>
-        </w:rPr>
-        <w:t xml:space="preserve"> </w:t>
-      </w:r>
-      <w:r>
-        <w:rPr>
-          <w:rStyle w:val="a8"/>
-          <w:rFonts w:cs="Times New Roman"/>
-          <w:szCs w:val="28"/>
-        </w:rPr>
-        <w:t>и</w:t>
-      </w:r>
-      <w:r>
-        <w:rPr>
-          <w:rStyle w:val="a8"/>
-          <w:rFonts w:cs="Times New Roman"/>
-          <w:szCs w:val="28"/>
-          <w:lang w:val="en-US"/>
-        </w:rPr>
-        <w:t xml:space="preserve"> </w:t>
-      </w:r>
-      <w:proofErr w:type="spellStart"/>
-      <w:r>
-        <w:rPr>
-          <w:rStyle w:val="a8"/>
-          <w:rFonts w:cs="Times New Roman"/>
-          <w:szCs w:val="28"/>
-          <w:lang w:val="en-US"/>
-        </w:rPr>
-        <w:t>ILSpy</w:t>
-      </w:r>
-      <w:proofErr w:type="spellEnd"/>
-    </w:p>
-    <w:p>
-      <w:pPr>
-        <w:rPr>
-          <w:szCs w:val="28"/>
-        </w:rPr>
-      </w:pPr>
-      <w:proofErr w:type="spellStart"/>
-      <w:r>
-        <w:rPr>
-          <w:szCs w:val="28"/>
-          <w:lang w:val="en-US"/>
-        </w:rPr>
-        <w:t>ILSpy</w:t>
-      </w:r>
-      <w:proofErr w:type="spellEnd"/>
-      <w:r>
-        <w:rPr>
-          <w:szCs w:val="28"/>
-        </w:rPr>
-        <w:t xml:space="preserve"> </w:t>
-      </w:r>
-      <w:r>
-        <w:rPr>
-          <w:szCs w:val="28"/>
-        </w:rPr>
-        <w:t xml:space="preserve">предоставляет возможность Метаданных и </w:t>
-      </w:r>
-      <w:proofErr w:type="spellStart"/>
-      <w:r>
-        <w:rPr>
-          <w:szCs w:val="28"/>
-        </w:rPr>
-        <w:t>Дебаг</w:t>
-      </w:r>
-      <w:proofErr w:type="spellEnd"/>
-      <w:r>
-        <w:rPr>
-          <w:szCs w:val="28"/>
-        </w:rPr>
-        <w:t>-</w:t>
-      </w:r>
-      <w:proofErr w:type="gramStart"/>
-      <w:r>
-        <w:rPr>
-          <w:szCs w:val="28"/>
-        </w:rPr>
-        <w:t>метаданных(</w:t>
-      </w:r>
-      <w:proofErr w:type="gramEnd"/>
-      <w:r>
-        <w:rPr>
-          <w:szCs w:val="28"/>
-        </w:rPr>
-        <w:t xml:space="preserve">при сборке в режиме </w:t>
-      </w:r>
-      <w:r>
-        <w:rPr>
-          <w:szCs w:val="28"/>
-          <w:lang w:val="en-US"/>
-        </w:rPr>
-        <w:t>Debug</w:t>
-      </w:r>
-      <w:r>
-        <w:rPr>
-          <w:szCs w:val="28"/>
-        </w:rPr>
-        <w:t>)</w:t>
-      </w:r>
-      <w:r>
-        <w:rPr>
-          <w:szCs w:val="28"/>
-        </w:rPr>
-        <w:t xml:space="preserve">. </w:t>
-      </w:r>
-      <w:r>
-        <w:rPr>
-          <w:szCs w:val="28"/>
-        </w:rPr>
-        <w:t xml:space="preserve">При этом </w:t>
-      </w:r>
-      <w:proofErr w:type="spellStart"/>
-      <w:r>
-        <w:rPr>
-          <w:szCs w:val="28"/>
-        </w:rPr>
-        <w:t>декомпилированный</w:t>
-      </w:r>
-      <w:proofErr w:type="spellEnd"/>
-      <w:r>
-        <w:rPr>
-          <w:szCs w:val="28"/>
-        </w:rPr>
-        <w:t xml:space="preserve"> псевдокод в </w:t>
-      </w:r>
-      <w:r>
-        <w:rPr>
-          <w:szCs w:val="28"/>
-        </w:rPr>
-        <w:t>.</w:t>
-      </w:r>
-      <w:r>
-        <w:rPr>
-          <w:szCs w:val="28"/>
-          <w:lang w:val="en-US"/>
-        </w:rPr>
-        <w:t>NET</w:t>
-      </w:r>
-      <w:r>
-        <w:rPr>
-          <w:szCs w:val="28"/>
-        </w:rPr>
-        <w:t xml:space="preserve"> </w:t>
-      </w:r>
-      <w:r>
-        <w:rPr>
-          <w:szCs w:val="28"/>
-          <w:lang w:val="en-US"/>
-        </w:rPr>
-        <w:t>Reflector</w:t>
-      </w:r>
-      <w:r>
-        <w:rPr>
-          <w:szCs w:val="28"/>
-        </w:rPr>
-        <w:t xml:space="preserve"> </w:t>
-      </w:r>
-      <w:r>
-        <w:rPr>
-          <w:szCs w:val="28"/>
-        </w:rPr>
-        <w:t>выглядит значительно проще и понятнее.</w:t>
-      </w:r>
-    </w:p>
-    <w:p>
-      <w:pPr>
-        <w:rPr>
-          <w:rStyle w:val="a8"/>
-          <w:rFonts w:cs="Times New Roman"/>
-          <w:szCs w:val="28"/>
-        </w:rPr>
-      </w:pPr>
-      <w:r>
-        <w:rPr>
-          <w:rStyle w:val="a8"/>
-          <w:rFonts w:cs="Times New Roman"/>
-          <w:szCs w:val="28"/>
-        </w:rPr>
-        <w:t xml:space="preserve">Двоичный код программы на </w:t>
-      </w:r>
-      <w:r>
-        <w:rPr>
-          <w:rStyle w:val="a8"/>
-          <w:rFonts w:cs="Times New Roman"/>
-          <w:szCs w:val="28"/>
-          <w:lang w:val="en-US"/>
-        </w:rPr>
-        <w:t>C</w:t>
-      </w:r>
-      <w:r>
-        <w:rPr>
-          <w:rStyle w:val="a8"/>
-          <w:rFonts w:cs="Times New Roman"/>
-          <w:szCs w:val="28"/>
         </w:rPr>
         <w:t>#</w:t>
       </w:r>
+      <w:bookmarkEnd w:id="4"/>
     </w:p>
     <w:p>
       <w:pPr>
@@ -2819,25 +3111,7 @@
           <w:szCs w:val="28"/>
           <w:shd w:val="clear" w:color="auto" w:fill="FFFFFF"/>
         </w:rPr>
-        <w:t xml:space="preserve"> </w:t>
-      </w:r>
-      <w:r>
-        <w:rPr>
-          <w:color w:val="0F1115"/>
-          <w:sz w:val="28"/>
-          <w:szCs w:val="28"/>
-          <w:shd w:val="clear" w:color="auto" w:fill="FFFFFF"/>
-        </w:rPr>
-        <w:t xml:space="preserve">Подсчёт </w:t>
-      </w:r>
-      <w:r>
-        <w:rPr>
-          <w:color w:val="0F1115"/>
-          <w:sz w:val="28"/>
-          <w:szCs w:val="28"/>
-          <w:shd w:val="clear" w:color="auto" w:fill="FFFFFF"/>
-        </w:rPr>
-        <w:t xml:space="preserve">количества строк </w:t>
+        <w:t xml:space="preserve"> Подсчёт количества строк </w:t>
       </w:r>
       <w:r>
         <w:rPr>
@@ -2940,7 +3214,6 @@
           <w:sz w:val="28"/>
           <w:szCs w:val="28"/>
           <w:shd w:val="clear" w:color="auto" w:fill="FFFFFF"/>
-          <w:lang w:val="en-US"/>
         </w:rPr>
       </w:pPr>
       <w:r>
@@ -3039,15 +3312,14 @@
           <w:color w:val="0F1115"/>
           <w:szCs w:val="28"/>
           <w:shd w:val="clear" w:color="auto" w:fill="FFFFFF"/>
-          <w:lang w:val="en-US" w:eastAsia="ru-RU"/>
-        </w:rPr>
-      </w:pPr>
-      <w:r>
-        <w:rPr>
-          <w:color w:val="0F1115"/>
-          <w:szCs w:val="28"/>
-          <w:shd w:val="clear" w:color="auto" w:fill="FFFFFF"/>
-          <w:lang w:val="en-US"/>
+          <w:lang w:eastAsia="ru-RU"/>
+        </w:rPr>
+      </w:pPr>
+      <w:r>
+        <w:rPr>
+          <w:color w:val="0F1115"/>
+          <w:szCs w:val="28"/>
+          <w:shd w:val="clear" w:color="auto" w:fill="FFFFFF"/>
         </w:rPr>
         <w:br w:type="page"/>
       </w:r>
@@ -3060,6 +3332,7 @@
           <w:szCs w:val="28"/>
         </w:rPr>
       </w:pPr>
+      <w:bookmarkStart w:id="5" w:name="_Toc231395077"/>
       <w:r>
         <w:rPr>
           <w:rStyle w:val="a8"/>
@@ -3069,6 +3342,7 @@
         <w:lastRenderedPageBreak/>
         <w:t>Вывод</w:t>
       </w:r>
+      <w:bookmarkEnd w:id="5"/>
     </w:p>
     <w:p>
       <w:pPr>
@@ -3725,6 +3999,7 @@
   <w:style w:type="character" w:default="1" w:styleId="a0">
     <w:name w:val="Default Paragraph Font"/>
     <w:uiPriority w:val="1"/>
+    <w:semiHidden/>
     <w:unhideWhenUsed/>
   </w:style>
   <w:style w:type="table" w:default="1" w:styleId="a1">

</xml_diff>

<commit_message>
Fix Lab 3 & Lab 4. Added Entropy screens. Fix Python code screens
</commit_message>
<xml_diff>
--- a/Задание 3 С#/Лр3_С#_Мавзовин_Пётр_ТКИ341_18.docx
+++ b/Задание 3 С#/Лр3_С#_Мавзовин_Пётр_ТКИ341_18.docx
@@ -268,21 +268,12 @@
           <w:szCs w:val="28"/>
         </w:rPr>
       </w:pPr>
-      <w:proofErr w:type="spellStart"/>
-      <w:r>
-        <w:rPr>
-          <w:rFonts w:cs="Times New Roman"/>
-          <w:szCs w:val="28"/>
-        </w:rPr>
-        <w:t>Мавзовин</w:t>
-      </w:r>
-      <w:proofErr w:type="spellEnd"/>
-      <w:r>
-        <w:rPr>
-          <w:rFonts w:cs="Times New Roman"/>
-          <w:szCs w:val="28"/>
-        </w:rPr>
-        <w:t xml:space="preserve"> П.В.</w:t>
+      <w:r>
+        <w:rPr>
+          <w:rFonts w:cs="Times New Roman"/>
+          <w:szCs w:val="28"/>
+        </w:rPr>
+        <w:t>Мавзовин П.В.</w:t>
       </w:r>
     </w:p>
     <w:p>
@@ -314,23 +305,7 @@
           <w:rFonts w:cs="Times New Roman"/>
           <w:szCs w:val="28"/>
         </w:rPr>
-        <w:t xml:space="preserve">Сидоренко </w:t>
-      </w:r>
-      <w:proofErr w:type="gramStart"/>
-      <w:r>
-        <w:rPr>
-          <w:rFonts w:cs="Times New Roman"/>
-          <w:szCs w:val="28"/>
-        </w:rPr>
-        <w:t>В.Г</w:t>
-      </w:r>
-      <w:proofErr w:type="gramEnd"/>
-      <w:r>
-        <w:rPr>
-          <w:rFonts w:cs="Times New Roman"/>
-          <w:szCs w:val="28"/>
-        </w:rPr>
-        <w:t>,</w:t>
+        <w:t>Сидоренко В.Г,</w:t>
       </w:r>
     </w:p>
     <w:p>
@@ -1257,7 +1232,6 @@
         </w:rPr>
         <w:t># (</w:t>
       </w:r>
-      <w:proofErr w:type="spellStart"/>
       <w:r>
         <w:rPr>
           <w:color w:val="0F1115"/>
@@ -1267,7 +1241,6 @@
         </w:rPr>
         <w:t>AICodeConvert</w:t>
       </w:r>
-      <w:proofErr w:type="spellEnd"/>
       <w:r>
         <w:rPr>
           <w:color w:val="0F1115"/>
@@ -1296,7 +1269,6 @@
         </w:rPr>
       </w:pPr>
       <w:bookmarkStart w:id="1" w:name="_Toc231395073"/>
-      <w:proofErr w:type="spellStart"/>
       <w:r>
         <w:rPr>
           <w:rStyle w:val="a8"/>
@@ -1307,7 +1279,6 @@
         <w:t>ILSpy</w:t>
       </w:r>
       <w:bookmarkEnd w:id="1"/>
-      <w:proofErr w:type="spellEnd"/>
     </w:p>
     <w:p>
       <w:pPr>
@@ -1387,25 +1358,7 @@
           <w:szCs w:val="28"/>
           <w:shd w:val="clear" w:color="auto" w:fill="FFFFFF"/>
         </w:rPr>
-        <w:t xml:space="preserve">Рисунок 2 – Заголовок </w:t>
-      </w:r>
-      <w:proofErr w:type="spellStart"/>
-      <w:r>
-        <w:rPr>
-          <w:color w:val="0F1115"/>
-          <w:szCs w:val="28"/>
-          <w:shd w:val="clear" w:color="auto" w:fill="FFFFFF"/>
-        </w:rPr>
-        <w:t>декомпилированной</w:t>
-      </w:r>
-      <w:proofErr w:type="spellEnd"/>
-      <w:r>
-        <w:rPr>
-          <w:color w:val="0F1115"/>
-          <w:szCs w:val="28"/>
-          <w:shd w:val="clear" w:color="auto" w:fill="FFFFFF"/>
-        </w:rPr>
-        <w:t xml:space="preserve"> программы </w:t>
+        <w:t xml:space="preserve">Рисунок 2 – Заголовок декомпилированной программы </w:t>
       </w:r>
       <w:r>
         <w:rPr>
@@ -1440,7 +1393,6 @@
         </w:rPr>
         <w:t xml:space="preserve"> </w:t>
       </w:r>
-      <w:proofErr w:type="spellStart"/>
       <w:r>
         <w:rPr>
           <w:color w:val="0F1115"/>
@@ -1450,7 +1402,6 @@
         </w:rPr>
         <w:t>ILSpy</w:t>
       </w:r>
-      <w:proofErr w:type="spellEnd"/>
     </w:p>
     <w:p>
       <w:pPr>
@@ -1547,25 +1498,7 @@
           <w:szCs w:val="28"/>
           <w:shd w:val="clear" w:color="auto" w:fill="FFFFFF"/>
         </w:rPr>
-        <w:t xml:space="preserve"> Заголовок </w:t>
-      </w:r>
-      <w:proofErr w:type="spellStart"/>
-      <w:r>
-        <w:rPr>
-          <w:color w:val="0F1115"/>
-          <w:szCs w:val="28"/>
-          <w:shd w:val="clear" w:color="auto" w:fill="FFFFFF"/>
-        </w:rPr>
-        <w:t>декомпилированной</w:t>
-      </w:r>
-      <w:proofErr w:type="spellEnd"/>
-      <w:r>
-        <w:rPr>
-          <w:color w:val="0F1115"/>
-          <w:szCs w:val="28"/>
-          <w:shd w:val="clear" w:color="auto" w:fill="FFFFFF"/>
-        </w:rPr>
-        <w:t xml:space="preserve"> программы </w:t>
+        <w:t xml:space="preserve"> Заголовок декомпилированной программы </w:t>
       </w:r>
       <w:r>
         <w:rPr>
@@ -1600,7 +1533,6 @@
         </w:rPr>
         <w:t xml:space="preserve"> </w:t>
       </w:r>
-      <w:proofErr w:type="spellStart"/>
       <w:r>
         <w:rPr>
           <w:color w:val="0F1115"/>
@@ -1610,7 +1542,6 @@
         </w:rPr>
         <w:t>ILSpy</w:t>
       </w:r>
-      <w:proofErr w:type="spellEnd"/>
     </w:p>
     <w:p>
       <w:pPr>
@@ -1708,7 +1639,6 @@
         </w:rPr>
         <w:t xml:space="preserve">Список зависимостей сборки в </w:t>
       </w:r>
-      <w:proofErr w:type="spellStart"/>
       <w:r>
         <w:rPr>
           <w:color w:val="0F1115"/>
@@ -1719,7 +1649,6 @@
         </w:rPr>
         <w:t>ILSpy</w:t>
       </w:r>
-      <w:proofErr w:type="spellEnd"/>
     </w:p>
     <w:p>
       <w:pPr>
@@ -1822,7 +1751,6 @@
         </w:rPr>
         <w:t xml:space="preserve">Листинг функций в </w:t>
       </w:r>
-      <w:proofErr w:type="spellStart"/>
       <w:r>
         <w:rPr>
           <w:color w:val="0F1115"/>
@@ -1833,7 +1761,6 @@
         </w:rPr>
         <w:t>ILSpy</w:t>
       </w:r>
-      <w:proofErr w:type="spellEnd"/>
     </w:p>
     <w:p>
       <w:pPr>
@@ -2308,27 +2235,7 @@
           <w:szCs w:val="28"/>
           <w:shd w:val="clear" w:color="auto" w:fill="FFFFFF"/>
         </w:rPr>
-        <w:t xml:space="preserve">Листинг </w:t>
-      </w:r>
-      <w:proofErr w:type="spellStart"/>
-      <w:r>
-        <w:rPr>
-          <w:color w:val="0F1115"/>
-          <w:sz w:val="28"/>
-          <w:szCs w:val="28"/>
-          <w:shd w:val="clear" w:color="auto" w:fill="FFFFFF"/>
-        </w:rPr>
-        <w:t>декомпилированной</w:t>
-      </w:r>
-      <w:proofErr w:type="spellEnd"/>
-      <w:r>
-        <w:rPr>
-          <w:color w:val="0F1115"/>
-          <w:sz w:val="28"/>
-          <w:szCs w:val="28"/>
-          <w:shd w:val="clear" w:color="auto" w:fill="FFFFFF"/>
-        </w:rPr>
-        <w:t xml:space="preserve"> программы в </w:t>
+        <w:t xml:space="preserve">Листинг декомпилированной программы в </w:t>
       </w:r>
       <w:r>
         <w:rPr>
@@ -2467,7 +2374,6 @@
         </w:rPr>
         <w:t xml:space="preserve"> </w:t>
       </w:r>
-      <w:proofErr w:type="spellStart"/>
       <w:r>
         <w:rPr>
           <w:rStyle w:val="a8"/>
@@ -2478,15 +2384,13 @@
         <w:t>ILSpy</w:t>
       </w:r>
       <w:bookmarkEnd w:id="3"/>
-      <w:proofErr w:type="spellEnd"/>
-    </w:p>
-    <w:p>
-      <w:pPr>
-        <w:rPr>
-          <w:szCs w:val="28"/>
-        </w:rPr>
-      </w:pPr>
-      <w:proofErr w:type="spellStart"/>
+    </w:p>
+    <w:p>
+      <w:pPr>
+        <w:rPr>
+          <w:szCs w:val="28"/>
+        </w:rPr>
+      </w:pPr>
       <w:r>
         <w:rPr>
           <w:szCs w:val="28"/>
@@ -2494,7 +2398,6 @@
         </w:rPr>
         <w:t>ILSpy</w:t>
       </w:r>
-      <w:proofErr w:type="spellEnd"/>
       <w:r>
         <w:rPr>
           <w:szCs w:val="28"/>
@@ -2505,35 +2408,7 @@
         <w:rPr>
           <w:szCs w:val="28"/>
         </w:rPr>
-        <w:t xml:space="preserve">предоставляет возможность Метаданных и </w:t>
-      </w:r>
-      <w:proofErr w:type="spellStart"/>
-      <w:r>
-        <w:rPr>
-          <w:szCs w:val="28"/>
-        </w:rPr>
-        <w:t>Дебаг</w:t>
-      </w:r>
-      <w:proofErr w:type="spellEnd"/>
-      <w:r>
-        <w:rPr>
-          <w:szCs w:val="28"/>
-        </w:rPr>
-        <w:t>-</w:t>
-      </w:r>
-      <w:proofErr w:type="gramStart"/>
-      <w:r>
-        <w:rPr>
-          <w:szCs w:val="28"/>
-        </w:rPr>
-        <w:t>метаданных(</w:t>
-      </w:r>
-      <w:proofErr w:type="gramEnd"/>
-      <w:r>
-        <w:rPr>
-          <w:szCs w:val="28"/>
-        </w:rPr>
-        <w:t xml:space="preserve">при сборке в режиме </w:t>
+        <w:t xml:space="preserve">предоставляет возможность Метаданных и Дебаг-метаданных(при сборке в режиме </w:t>
       </w:r>
       <w:r>
         <w:rPr>
@@ -2558,21 +2433,7 @@
         <w:rPr>
           <w:szCs w:val="28"/>
         </w:rPr>
-        <w:t xml:space="preserve">При этом </w:t>
-      </w:r>
-      <w:proofErr w:type="spellStart"/>
-      <w:r>
-        <w:rPr>
-          <w:szCs w:val="28"/>
-        </w:rPr>
-        <w:t>декомпилированный</w:t>
-      </w:r>
-      <w:proofErr w:type="spellEnd"/>
-      <w:r>
-        <w:rPr>
-          <w:szCs w:val="28"/>
-        </w:rPr>
-        <w:t xml:space="preserve"> псевдокод в </w:t>
+        <w:t xml:space="preserve">При этом декомпилированный псевдокод в </w:t>
       </w:r>
       <w:r>
         <w:rPr>
@@ -2838,25 +2699,14 @@
         </w:rPr>
         <w:t>c</w:t>
       </w:r>
-      <w:proofErr w:type="spellStart"/>
-      <w:r>
-        <w:rPr>
-          <w:color w:val="0F1115"/>
-          <w:sz w:val="28"/>
-          <w:szCs w:val="28"/>
-          <w:shd w:val="clear" w:color="auto" w:fill="FFFFFF"/>
-        </w:rPr>
-        <w:t>екция</w:t>
-      </w:r>
-      <w:proofErr w:type="spellEnd"/>
-      <w:r>
-        <w:rPr>
-          <w:color w:val="0F1115"/>
-          <w:sz w:val="28"/>
-          <w:szCs w:val="28"/>
-          <w:shd w:val="clear" w:color="auto" w:fill="FFFFFF"/>
-        </w:rPr>
-        <w:t xml:space="preserve"> </w:t>
+      <w:r>
+        <w:rPr>
+          <w:color w:val="0F1115"/>
+          <w:sz w:val="28"/>
+          <w:szCs w:val="28"/>
+          <w:shd w:val="clear" w:color="auto" w:fill="FFFFFF"/>
+        </w:rPr>
+        <w:t xml:space="preserve">екция </w:t>
       </w:r>
       <w:r>
         <w:rPr>
@@ -2976,7 +2826,6 @@
         </w:rPr>
         <w:t xml:space="preserve">Подсчёт энтропии </w:t>
       </w:r>
-      <w:proofErr w:type="spellStart"/>
       <w:r>
         <w:rPr>
           <w:color w:val="0F1115"/>
@@ -2987,7 +2836,6 @@
         </w:rPr>
         <w:t>dll</w:t>
       </w:r>
-      <w:proofErr w:type="spellEnd"/>
       <w:r>
         <w:rPr>
           <w:color w:val="0F1115"/>
@@ -2996,6 +2844,52 @@
           <w:shd w:val="clear" w:color="auto" w:fill="FFFFFF"/>
         </w:rPr>
         <w:t xml:space="preserve"> </w:t>
+      </w:r>
+      <w:r>
+        <w:rPr>
+          <w:color w:val="0F1115"/>
+          <w:sz w:val="28"/>
+          <w:szCs w:val="28"/>
+          <w:shd w:val="clear" w:color="auto" w:fill="FFFFFF"/>
+        </w:rPr>
+        <w:t>файла</w:t>
+      </w:r>
+      <w:r>
+        <w:rPr>
+          <w:color w:val="0F1115"/>
+          <w:sz w:val="28"/>
+          <w:szCs w:val="28"/>
+          <w:shd w:val="clear" w:color="auto" w:fill="FFFFFF"/>
+        </w:rPr>
+        <w:t>. График значений энтропии от байтов файла</w:t>
+      </w:r>
+      <w:r>
+        <w:rPr>
+          <w:color w:val="0F1115"/>
+          <w:sz w:val="28"/>
+          <w:szCs w:val="28"/>
+          <w:shd w:val="clear" w:color="auto" w:fill="FFFFFF"/>
+        </w:rPr>
+        <w:t>.</w:t>
+      </w:r>
+      <w:r>
+        <w:rPr>
+          <w:color w:val="0F1115"/>
+          <w:sz w:val="28"/>
+          <w:szCs w:val="28"/>
+          <w:shd w:val="clear" w:color="auto" w:fill="FFFFFF"/>
+        </w:rPr>
+        <w:t xml:space="preserve"> Энтропия </w:t>
+      </w:r>
+      <w:r>
+        <w:rPr>
+          <w:color w:val="0F1115"/>
+          <w:sz w:val="28"/>
+          <w:szCs w:val="28"/>
+          <w:shd w:val="clear" w:color="auto" w:fill="FFFFFF"/>
+          <w:lang w:val="en-US"/>
+        </w:rPr>
+        <w:t xml:space="preserve">dll </w:t>
       </w:r>
       <w:r>
         <w:rPr>
@@ -3120,39 +3014,8 @@
           <w:szCs w:val="28"/>
           <w:shd w:val="clear" w:color="auto" w:fill="FFFFFF"/>
         </w:rPr>
-        <w:t xml:space="preserve">в </w:t>
-      </w:r>
-      <w:proofErr w:type="spellStart"/>
-      <w:r>
-        <w:rPr>
-          <w:color w:val="0F1115"/>
-          <w:sz w:val="28"/>
-          <w:szCs w:val="28"/>
-          <w:shd w:val="clear" w:color="auto" w:fill="FFFFFF"/>
-        </w:rPr>
-        <w:t>декомпилированном</w:t>
-      </w:r>
-      <w:proofErr w:type="spellEnd"/>
-      <w:r>
-        <w:rPr>
-          <w:color w:val="0F1115"/>
-          <w:sz w:val="28"/>
-          <w:szCs w:val="28"/>
-          <w:shd w:val="clear" w:color="auto" w:fill="FFFFFF"/>
-        </w:rPr>
-        <w:t xml:space="preserve"> коде программы, полученном с помощью .NET </w:t>
-      </w:r>
-      <w:proofErr w:type="spellStart"/>
-      <w:r>
-        <w:rPr>
-          <w:color w:val="0F1115"/>
-          <w:sz w:val="28"/>
-          <w:szCs w:val="28"/>
-          <w:shd w:val="clear" w:color="auto" w:fill="FFFFFF"/>
-        </w:rPr>
-        <w:t>Reflector</w:t>
-      </w:r>
-      <w:proofErr w:type="spellEnd"/>
+        <w:t>в декомпилированном коде программы, полученном с помощью .NET Reflector</w:t>
+      </w:r>
     </w:p>
     <w:p>
       <w:pPr>
@@ -3268,29 +3131,8 @@
           <w:szCs w:val="28"/>
           <w:shd w:val="clear" w:color="auto" w:fill="FFFFFF"/>
         </w:rPr>
-        <w:t xml:space="preserve">в </w:t>
-      </w:r>
-      <w:proofErr w:type="spellStart"/>
-      <w:r>
-        <w:rPr>
-          <w:color w:val="0F1115"/>
-          <w:sz w:val="28"/>
-          <w:szCs w:val="28"/>
-          <w:shd w:val="clear" w:color="auto" w:fill="FFFFFF"/>
-        </w:rPr>
-        <w:t>декомпилированном</w:t>
-      </w:r>
-      <w:proofErr w:type="spellEnd"/>
-      <w:r>
-        <w:rPr>
-          <w:color w:val="0F1115"/>
-          <w:sz w:val="28"/>
-          <w:szCs w:val="28"/>
-          <w:shd w:val="clear" w:color="auto" w:fill="FFFFFF"/>
-        </w:rPr>
-        <w:t xml:space="preserve"> коде программы, полученном с помощью </w:t>
-      </w:r>
-      <w:proofErr w:type="spellStart"/>
+        <w:t xml:space="preserve">в декомпилированном коде программы, полученном с помощью </w:t>
+      </w:r>
       <w:r>
         <w:rPr>
           <w:color w:val="0F1115"/>
@@ -3301,7 +3143,6 @@
         </w:rPr>
         <w:t>ILSpy</w:t>
       </w:r>
-      <w:proofErr w:type="spellEnd"/>
     </w:p>
     <w:p>
       <w:pPr>
@@ -3357,23 +3198,7 @@
           <w:sz w:val="28"/>
           <w:szCs w:val="28"/>
         </w:rPr>
-        <w:t xml:space="preserve">В ходе выполнения лабораторной работы были изучены и применены методы реверс-инжиниринга программного обеспечения, включающие конвертацию исходного кода с языка C++ на C# с использованием средств автоматизированного преобразования. Была рассмотрена </w:t>
-      </w:r>
-      <w:proofErr w:type="spellStart"/>
-      <w:r>
-        <w:rPr>
-          <w:sz w:val="28"/>
-          <w:szCs w:val="28"/>
-        </w:rPr>
-        <w:t>итерационность</w:t>
-      </w:r>
-      <w:proofErr w:type="spellEnd"/>
-      <w:r>
-        <w:rPr>
-          <w:sz w:val="28"/>
-          <w:szCs w:val="28"/>
-        </w:rPr>
-        <w:t xml:space="preserve"> процесса конвертации и отмечены возможные отклонения результатов при первичном переводе кода.</w:t>
+        <w:t>В ходе выполнения лабораторной работы были изучены и применены методы реверс-инжиниринга программного обеспечения, включающие конвертацию исходного кода с языка C++ на C# с использованием средств автоматизированного преобразования. Была рассмотрена итерационность процесса конвертации и отмечены возможные отклонения результатов при первичном переводе кода.</w:t>
       </w:r>
     </w:p>
     <w:p>
@@ -3389,87 +3214,7 @@
           <w:sz w:val="28"/>
           <w:szCs w:val="28"/>
         </w:rPr>
-        <w:t xml:space="preserve">С использованием инструментов </w:t>
-      </w:r>
-      <w:proofErr w:type="spellStart"/>
-      <w:r>
-        <w:rPr>
-          <w:sz w:val="28"/>
-          <w:szCs w:val="28"/>
-        </w:rPr>
-        <w:t>ILSpy</w:t>
-      </w:r>
-      <w:proofErr w:type="spellEnd"/>
-      <w:r>
-        <w:rPr>
-          <w:sz w:val="28"/>
-          <w:szCs w:val="28"/>
-        </w:rPr>
-        <w:t xml:space="preserve"> и .NET </w:t>
-      </w:r>
-      <w:proofErr w:type="spellStart"/>
-      <w:r>
-        <w:rPr>
-          <w:sz w:val="28"/>
-          <w:szCs w:val="28"/>
-        </w:rPr>
-        <w:t>Reflector</w:t>
-      </w:r>
-      <w:proofErr w:type="spellEnd"/>
-      <w:r>
-        <w:rPr>
-          <w:sz w:val="28"/>
-          <w:szCs w:val="28"/>
-        </w:rPr>
-        <w:t xml:space="preserve"> был проведён анализ полученных .NET-сборок. В ходе исследования выполнено сравнение результатов декомпиляции, полученных различными средствами, что позволило выявить различия в представлении псевдокода, структуре метаданных и уровне детализации восстановленного исходного кода. Установлено, что </w:t>
-      </w:r>
-      <w:proofErr w:type="spellStart"/>
-      <w:r>
-        <w:rPr>
-          <w:sz w:val="28"/>
-          <w:szCs w:val="28"/>
-        </w:rPr>
-        <w:t>ILSpy</w:t>
-      </w:r>
-      <w:proofErr w:type="spellEnd"/>
-      <w:r>
-        <w:rPr>
-          <w:sz w:val="28"/>
-          <w:szCs w:val="28"/>
-        </w:rPr>
-        <w:t xml:space="preserve"> предоставляет более детализированную информацию о метаданных и отладочных структурах, тогда как .NET </w:t>
-      </w:r>
-      <w:proofErr w:type="spellStart"/>
-      <w:r>
-        <w:rPr>
-          <w:sz w:val="28"/>
-          <w:szCs w:val="28"/>
-        </w:rPr>
-        <w:t>Reflector</w:t>
-      </w:r>
-      <w:proofErr w:type="spellEnd"/>
-      <w:r>
-        <w:rPr>
-          <w:sz w:val="28"/>
-          <w:szCs w:val="28"/>
-        </w:rPr>
-        <w:t xml:space="preserve"> формирует более упрощённое и читаемое представление </w:t>
-      </w:r>
-      <w:proofErr w:type="spellStart"/>
-      <w:r>
-        <w:rPr>
-          <w:sz w:val="28"/>
-          <w:szCs w:val="28"/>
-        </w:rPr>
-        <w:t>декомпилированного</w:t>
-      </w:r>
-      <w:proofErr w:type="spellEnd"/>
-      <w:r>
-        <w:rPr>
-          <w:sz w:val="28"/>
-          <w:szCs w:val="28"/>
-        </w:rPr>
-        <w:t xml:space="preserve"> кода.</w:t>
+        <w:t>С использованием инструментов ILSpy и .NET Reflector был проведён анализ полученных .NET-сборок. В ходе исследования выполнено сравнение результатов декомпиляции, полученных различными средствами, что позволило выявить различия в представлении псевдокода, структуре метаданных и уровне детализации восстановленного исходного кода. Установлено, что ILSpy предоставляет более детализированную информацию о метаданных и отладочных структурах, тогда как .NET Reflector формирует более упрощённое и читаемое представление декомпилированного кода.</w:t>
       </w:r>
     </w:p>
     <w:p>
@@ -3485,55 +3230,7 @@
           <w:sz w:val="28"/>
           <w:szCs w:val="28"/>
         </w:rPr>
-        <w:t xml:space="preserve">Также был выполнен анализ структуры исполняемого файла с использованием </w:t>
-      </w:r>
-      <w:proofErr w:type="spellStart"/>
-      <w:r>
-        <w:rPr>
-          <w:sz w:val="28"/>
-          <w:szCs w:val="28"/>
-        </w:rPr>
-        <w:t>hex</w:t>
-      </w:r>
-      <w:proofErr w:type="spellEnd"/>
-      <w:r>
-        <w:rPr>
-          <w:sz w:val="28"/>
-          <w:szCs w:val="28"/>
-        </w:rPr>
-        <w:t>-редактора, в ходе которого исследованы секции PE-файла, включая область .</w:t>
-      </w:r>
-      <w:proofErr w:type="spellStart"/>
-      <w:r>
-        <w:rPr>
-          <w:sz w:val="28"/>
-          <w:szCs w:val="28"/>
-        </w:rPr>
-        <w:t>text</w:t>
-      </w:r>
-      <w:proofErr w:type="spellEnd"/>
-      <w:r>
-        <w:rPr>
-          <w:sz w:val="28"/>
-          <w:szCs w:val="28"/>
-        </w:rPr>
-        <w:t xml:space="preserve">, содержащую машинный код программы. Дополнительно была рассчитана энтропия DLL-файла, что позволило оценить степень его уплотнения и потенциальную сложность анализа. Проведён подсчёт строк </w:t>
-      </w:r>
-      <w:proofErr w:type="spellStart"/>
-      <w:r>
-        <w:rPr>
-          <w:sz w:val="28"/>
-          <w:szCs w:val="28"/>
-        </w:rPr>
-        <w:t>декомпилированного</w:t>
-      </w:r>
-      <w:proofErr w:type="spellEnd"/>
-      <w:r>
-        <w:rPr>
-          <w:sz w:val="28"/>
-          <w:szCs w:val="28"/>
-        </w:rPr>
-        <w:t xml:space="preserve"> кода, полученного различными инструментами, что позволило количественно сравнить результаты реверс-инжиниринга.</w:t>
+        <w:t>Также был выполнен анализ структуры исполняемого файла с использованием hex-редактора, в ходе которого исследованы секции PE-файла, включая область .text, содержащую машинный код программы. Дополнительно была рассчитана энтропия DLL-файла, что позволило оценить степень его уплотнения и потенциальную сложность анализа. Проведён подсчёт строк декомпилированного кода, полученного различными инструментами, что позволило количественно сравнить результаты реверс-инжиниринга.</w:t>
       </w:r>
     </w:p>
     <w:p>

</xml_diff>